<commit_message>
Update Python FIM HIDS Paper.docx
Fixed a small error in one of the images in the paper
</commit_message>
<xml_diff>
--- a/Python FIM HIDS Paper.docx
+++ b/Python FIM HIDS Paper.docx
@@ -2863,7 +2863,7 @@
                                 <w:sz w:val="20"/>
                                 <w:szCs w:val="20"/>
                               </w:rPr>
-                              <w:t>2026-04-29T21:10:01 event=BASELINE_MISSING path="/</w:t>
+                              <w:t>2026-04-29T21:10:01 event=BASELINE_MISSING path="</w:t>
                             </w:r>
                             <w:r>
                               <w:rPr>
@@ -2951,7 +2951,7 @@
                                 <w:sz w:val="20"/>
                                 <w:szCs w:val="20"/>
                               </w:rPr>
-                              <w:t>2026-04-29T21:10:01 event=BASELINE_CREATED path="/</w:t>
+                              <w:t>2026-04-29T21:10:01 event=BASELINE_CREATED path="</w:t>
                             </w:r>
                             <w:r>
                               <w:rPr>
@@ -3071,7 +3071,7 @@
                           <w:sz w:val="20"/>
                           <w:szCs w:val="20"/>
                         </w:rPr>
-                        <w:t>2026-04-29T21:10:01 event=BASELINE_MISSING path="/</w:t>
+                        <w:t>2026-04-29T21:10:01 event=BASELINE_MISSING path="</w:t>
                       </w:r>
                       <w:r>
                         <w:rPr>
@@ -3159,7 +3159,7 @@
                           <w:sz w:val="20"/>
                           <w:szCs w:val="20"/>
                         </w:rPr>
-                        <w:t>2026-04-29T21:10:01 event=BASELINE_CREATED path="/</w:t>
+                        <w:t>2026-04-29T21:10:01 event=BASELINE_CREATED path="</w:t>
                       </w:r>
                       <w:r>
                         <w:rPr>
@@ -7940,6 +7940,27 @@
 </file>
 
 <file path=customXml/item1.xml><?xml version="1.0" encoding="utf-8"?>
+<?mso-contentType ?>
+<FormTemplates xmlns="http://schemas.microsoft.com/sharepoint/v3/contenttype/forms">
+  <Display>DocumentLibraryForm</Display>
+  <Edit>DocumentLibraryForm</Edit>
+  <New>DocumentLibraryForm</New>
+</FormTemplates>
+</file>
+
+<file path=customXml/item2.xml><?xml version="1.0" encoding="utf-8"?>
+<p:properties xmlns:p="http://schemas.microsoft.com/office/2006/metadata/properties" xmlns:xsi="http://www.w3.org/2001/XMLSchema-instance" xmlns:pc="http://schemas.microsoft.com/office/infopath/2007/PartnerControls">
+  <documentManagement>
+    <_activity xmlns="fd2f77bf-7668-4a2b-b233-0858c5755b4e" xsi:nil="true"/>
+  </documentManagement>
+</p:properties>
+</file>
+
+<file path=customXml/item3.xml><?xml version="1.0" encoding="utf-8"?>
+<b:Sources xmlns:b="http://schemas.openxmlformats.org/officeDocument/2006/bibliography" xmlns="http://schemas.openxmlformats.org/officeDocument/2006/bibliography" SelectedStyle="\APASixthEditionOfficeOnline.xsl" StyleName="APA" Version="6"/>
+</file>
+
+<file path=customXml/item4.xml><?xml version="1.0" encoding="utf-8"?>
 <ct:contentTypeSchema xmlns:ct="http://schemas.microsoft.com/office/2006/metadata/contentType" xmlns:ma="http://schemas.microsoft.com/office/2006/metadata/properties/metaAttributes" ct:_="" ma:_="" ma:contentTypeName="Document" ma:contentTypeID="0x01010064B90A86F1C9C04D94C944FC4EE0F168" ma:contentTypeVersion="12" ma:contentTypeDescription="Create a new document." ma:contentTypeScope="" ma:versionID="68697608f4eed12fe2daf803f7dec6c7">
   <xsd:schema xmlns:xsd="http://www.w3.org/2001/XMLSchema" xmlns:xs="http://www.w3.org/2001/XMLSchema" xmlns:p="http://schemas.microsoft.com/office/2006/metadata/properties" xmlns:ns3="fd2f77bf-7668-4a2b-b233-0858c5755b4e" targetNamespace="http://schemas.microsoft.com/office/2006/metadata/properties" ma:root="true" ma:fieldsID="4ffe6157cba3af957414ee884ce3214d" ns3:_="">
     <xsd:import namespace="fd2f77bf-7668-4a2b-b233-0858c5755b4e"/>
@@ -8133,28 +8154,33 @@
 </ct:contentTypeSchema>
 </file>
 
-<file path=customXml/item2.xml><?xml version="1.0" encoding="utf-8"?>
-<b:Sources xmlns:b="http://schemas.openxmlformats.org/officeDocument/2006/bibliography" xmlns="http://schemas.openxmlformats.org/officeDocument/2006/bibliography" SelectedStyle="\APASixthEditionOfficeOnline.xsl" StyleName="APA" Version="6"/>
+<file path=customXml/itemProps1.xml><?xml version="1.0" encoding="utf-8"?>
+<ds:datastoreItem xmlns:ds="http://schemas.openxmlformats.org/officeDocument/2006/customXml" ds:itemID="{0C2B986A-C07A-4920-881C-77922D401C03}">
+  <ds:schemaRefs>
+    <ds:schemaRef ds:uri="http://schemas.microsoft.com/sharepoint/v3/contenttype/forms"/>
+  </ds:schemaRefs>
+</ds:datastoreItem>
 </file>
 
-<file path=customXml/item3.xml><?xml version="1.0" encoding="utf-8"?>
-<p:properties xmlns:p="http://schemas.microsoft.com/office/2006/metadata/properties" xmlns:xsi="http://www.w3.org/2001/XMLSchema-instance" xmlns:pc="http://schemas.microsoft.com/office/infopath/2007/PartnerControls">
-  <documentManagement>
-    <_activity xmlns="fd2f77bf-7668-4a2b-b233-0858c5755b4e" xsi:nil="true"/>
-  </documentManagement>
-</p:properties>
+<file path=customXml/itemProps2.xml><?xml version="1.0" encoding="utf-8"?>
+<ds:datastoreItem xmlns:ds="http://schemas.openxmlformats.org/officeDocument/2006/customXml" ds:itemID="{D15CB74C-26EC-49D5-970D-55ED186258A7}">
+  <ds:schemaRefs>
+    <ds:schemaRef ds:uri="http://schemas.microsoft.com/office/2006/metadata/properties"/>
+    <ds:schemaRef ds:uri="http://schemas.microsoft.com/office/infopath/2007/PartnerControls"/>
+    <ds:schemaRef ds:uri="fd2f77bf-7668-4a2b-b233-0858c5755b4e"/>
+  </ds:schemaRefs>
+</ds:datastoreItem>
 </file>
 
-<file path=customXml/item4.xml><?xml version="1.0" encoding="utf-8"?>
-<?mso-contentType ?>
-<FormTemplates xmlns="http://schemas.microsoft.com/sharepoint/v3/contenttype/forms">
-  <Display>DocumentLibraryForm</Display>
-  <Edit>DocumentLibraryForm</Edit>
-  <New>DocumentLibraryForm</New>
-</FormTemplates>
+<file path=customXml/itemProps3.xml><?xml version="1.0" encoding="utf-8"?>
+<ds:datastoreItem xmlns:ds="http://schemas.openxmlformats.org/officeDocument/2006/customXml" ds:itemID="{220BF2EE-3091-47C3-BB32-C97C96B28EA8}">
+  <ds:schemaRefs>
+    <ds:schemaRef ds:uri="http://schemas.openxmlformats.org/officeDocument/2006/bibliography"/>
+  </ds:schemaRefs>
+</ds:datastoreItem>
 </file>
 
-<file path=customXml/itemProps1.xml><?xml version="1.0" encoding="utf-8"?>
+<file path=customXml/itemProps4.xml><?xml version="1.0" encoding="utf-8"?>
 <ds:datastoreItem xmlns:ds="http://schemas.openxmlformats.org/officeDocument/2006/customXml" ds:itemID="{D28BEE03-881E-4FDA-A00B-C6D187D4E9EE}">
   <ds:schemaRefs>
     <ds:schemaRef ds:uri="http://schemas.microsoft.com/office/2006/metadata/contentType"/>
@@ -8172,32 +8198,6 @@
 </ds:datastoreItem>
 </file>
 
-<file path=customXml/itemProps2.xml><?xml version="1.0" encoding="utf-8"?>
-<ds:datastoreItem xmlns:ds="http://schemas.openxmlformats.org/officeDocument/2006/customXml" ds:itemID="{220BF2EE-3091-47C3-BB32-C97C96B28EA8}">
-  <ds:schemaRefs>
-    <ds:schemaRef ds:uri="http://schemas.openxmlformats.org/officeDocument/2006/bibliography"/>
-  </ds:schemaRefs>
-</ds:datastoreItem>
-</file>
-
-<file path=customXml/itemProps3.xml><?xml version="1.0" encoding="utf-8"?>
-<ds:datastoreItem xmlns:ds="http://schemas.openxmlformats.org/officeDocument/2006/customXml" ds:itemID="{D15CB74C-26EC-49D5-970D-55ED186258A7}">
-  <ds:schemaRefs>
-    <ds:schemaRef ds:uri="http://schemas.microsoft.com/office/2006/metadata/properties"/>
-    <ds:schemaRef ds:uri="http://schemas.microsoft.com/office/infopath/2007/PartnerControls"/>
-    <ds:schemaRef ds:uri="fd2f77bf-7668-4a2b-b233-0858c5755b4e"/>
-  </ds:schemaRefs>
-</ds:datastoreItem>
-</file>
-
-<file path=customXml/itemProps4.xml><?xml version="1.0" encoding="utf-8"?>
-<ds:datastoreItem xmlns:ds="http://schemas.openxmlformats.org/officeDocument/2006/customXml" ds:itemID="{0C2B986A-C07A-4920-881C-77922D401C03}">
-  <ds:schemaRefs>
-    <ds:schemaRef ds:uri="http://schemas.microsoft.com/sharepoint/v3/contenttype/forms"/>
-  </ds:schemaRefs>
-</ds:datastoreItem>
-</file>
-
 <file path=docMetadata/LabelInfo.xml><?xml version="1.0" encoding="utf-8"?>
 <clbl:labelList xmlns:clbl="http://schemas.microsoft.com/office/2020/mipLabelMetadata">
   <clbl:label id="{baf8218e-b302-4465-a993-4a39c97251b2}" enabled="0" method="" siteId="{baf8218e-b302-4465-a993-4a39c97251b2}" removed="1"/>

</xml_diff>